<commit_message>
Fix Oct 24 merge breakages (contract auto-send, emails, request list, reorder); document Prompt 10 rules; FR-04 re-checked; docs and dashboards to 100%
</commit_message>
<xml_diff>
--- a/docs/Checklist_Status.docx
+++ b/docs/Checklist_Status.docx
@@ -18,7 +18,7 @@
         <w:rPr>
           <w:i/>
         </w:rPr>
-        <w:t>IT Procurement Intelligence Platform · reviewed against the main branch, 23 Oct 2026</w:t>
+        <w:t>IT Procurement Intelligence Platform · reviewed against the main branch, 23 Oct 2026; re-checked 25 Oct</w:t>
       </w:r>
     </w:p>
     <w:p>
@@ -1336,7 +1336,7 @@
                 <w:b/>
                 <w:sz w:val="19"/>
               </w:rPr>
-              <w:t>Partially done</w:t>
+              <w:t>Done</w:t>
             </w:r>
           </w:p>
         </w:tc>
@@ -1350,7 +1350,7 @@
               <w:rPr>
                 <w:sz w:val="19"/>
               </w:rPr>
-              <w:t>Builds without errors, but not yet published to GitHub Pages (repo owner: Actions → Docs → Run workflow).</w:t>
+              <w:t>Published 23 Oct at anoojshete.github.io/ProcurementAutomation; builds cleanly. Republish after doc changes (Actions → Docs → Run workflow).</w:t>
             </w:r>
           </w:p>
         </w:tc>
@@ -2026,7 +2026,7 @@
                 <w:b/>
                 <w:sz w:val="19"/>
               </w:rPr>
-              <w:t>Partially done</w:t>
+              <w:t>Done</w:t>
             </w:r>
           </w:p>
         </w:tc>
@@ -2040,7 +2040,7 @@
               <w:rPr>
                 <w:sz w:val="19"/>
               </w:rPr>
-              <w:t>Not published.</w:t>
+              <w:t>Published; republish after changes.</w:t>
             </w:r>
           </w:p>
         </w:tc>
@@ -2133,7 +2133,7 @@
               <w:rPr>
                 <w:sz w:val="19"/>
               </w:rPr>
-              <w:t>Company SMTP passwords are encrypted with a key that is written in the public code (SMTP_ENCRYPTION_SECRET is not passed to the service). Set a real secret before any shared deployment; saved SMTP passwords must then be entered again.</w:t>
+              <w:t>Company SMTP passwords: a missing key now stops the service in production, but the encryption code reads a missing APP_ENV as development and then uses a key that is public in the code. Set APP_ENV=production and MASTER_ENCRYPTION_KEY before any shared deployment.</w:t>
             </w:r>
           </w:p>
         </w:tc>
@@ -2239,7 +2239,7 @@
               <w:rPr>
                 <w:sz w:val="19"/>
               </w:rPr>
-              <w:t>Tests, 23 Oct</w:t>
+              <w:t>Fixed 25 Oct</w:t>
             </w:r>
           </w:p>
         </w:tc>
@@ -2253,7 +2253,97 @@
               <w:rPr>
                 <w:sz w:val="19"/>
               </w:rPr>
-              <w:t>1,276 automated service tests pass; root tests, typecheck and the docs build are clean.</w:t>
+              <w:t>After the 24 Oct merges, contract generation and auto-send, approval and contract emails, and the request list for admin and finance failed. Fixed, each with a test.</w:t>
+            </w:r>
+          </w:p>
+        </w:tc>
+      </w:tr>
+      <w:tr>
+        <w:tc>
+          <w:tcPr>
+            <w:tcW w:type="dxa" w:w="2041"/>
+          </w:tcPr>
+          <w:p>
+            <w:r/>
+            <w:r>
+              <w:rPr>
+                <w:sz w:val="19"/>
+              </w:rPr>
+              <w:t>Needs a decision</w:t>
+            </w:r>
+          </w:p>
+        </w:tc>
+        <w:tc>
+          <w:tcPr>
+            <w:tcW w:type="dxa" w:w="7824"/>
+          </w:tcPr>
+          <w:p>
+            <w:r/>
+            <w:r>
+              <w:rPr>
+                <w:sz w:val="19"/>
+              </w:rPr>
+              <w:t>Bulk and email approval can't check a vendor's clearance (401), so requests with a vendor are never bulk-approved. Choose how services authenticate to each other.</w:t>
+            </w:r>
+          </w:p>
+        </w:tc>
+      </w:tr>
+      <w:tr>
+        <w:tc>
+          <w:tcPr>
+            <w:tcW w:type="dxa" w:w="2041"/>
+          </w:tcPr>
+          <w:p>
+            <w:r/>
+            <w:r>
+              <w:rPr>
+                <w:sz w:val="19"/>
+              </w:rPr>
+              <w:t>Niraj</w:t>
+            </w:r>
+          </w:p>
+        </w:tc>
+        <w:tc>
+          <w:tcPr>
+            <w:tcW w:type="dxa" w:w="7824"/>
+          </w:tcPr>
+          <w:p>
+            <w:r/>
+            <w:r>
+              <w:rPr>
+                <w:sz w:val="19"/>
+              </w:rPr>
+              <w:t>Signing mandates: the password re-check calls the wrong auth-service port, so the real password is never checked.</w:t>
+            </w:r>
+          </w:p>
+        </w:tc>
+      </w:tr>
+      <w:tr>
+        <w:tc>
+          <w:tcPr>
+            <w:tcW w:type="dxa" w:w="2041"/>
+          </w:tcPr>
+          <w:p>
+            <w:r/>
+            <w:r>
+              <w:rPr>
+                <w:sz w:val="19"/>
+              </w:rPr>
+              <w:t>Tests, 25 Oct</w:t>
+            </w:r>
+          </w:p>
+        </w:tc>
+        <w:tc>
+          <w:tcPr>
+            <w:tcW w:type="dxa" w:w="7824"/>
+          </w:tcPr>
+          <w:p>
+            <w:r/>
+            <w:r>
+              <w:rPr>
+                <w:sz w:val="19"/>
+              </w:rPr>
+              <w:t>1,330 automated service tests pass; root tests, typecheck and the docs build are clean; invoice lifecycle 71/71 and demo 28/28 through the gateway.</w:t>
             </w:r>
           </w:p>
         </w:tc>

</xml_diff>